<commit_message>
Perubahan Template dan TTE
</commit_message>
<xml_diff>
--- a/public/templates/SKBORO.docx
+++ b/public/templates/SKBORO.docx
@@ -2580,24 +2580,7 @@
                 <w:sz w:val="22"/>
                 <w:szCs w:val="22"/>
               </w:rPr>
-              <w:t>${</w:t>
-            </w:r>
-            <w:r>
-              <w:rPr>
-                <w:rFonts w:hint="default" w:ascii="Arial" w:hAnsi="Arial" w:cs="Arial"/>
-                <w:sz w:val="22"/>
-                <w:szCs w:val="22"/>
-                <w:lang w:val="en-US"/>
-              </w:rPr>
-              <w:t>qr</w:t>
-            </w:r>
-            <w:r>
-              <w:rPr>
-                <w:rFonts w:ascii="Arial" w:hAnsi="Arial" w:cs="Arial"/>
-                <w:sz w:val="22"/>
-                <w:szCs w:val="22"/>
-              </w:rPr>
-              <w:t>}</w:t>
+              <w:t>${qr}</w:t>
             </w:r>
           </w:p>
         </w:tc>
@@ -2686,7 +2669,7 @@
                 <w:vertAlign w:val="baseline"/>
                 <w:lang w:val="en-US"/>
               </w:rPr>
-              <w:t>[[qr_here]]</w:t>
+              <w:t xml:space="preserve"/>
             </w:r>
           </w:p>
           <w:p>

</xml_diff>

<commit_message>
Pembaruan ALL Super admin
</commit_message>
<xml_diff>
--- a/public/templates/SKBORO.docx
+++ b/public/templates/SKBORO.docx
@@ -1688,8 +1688,8 @@
     <w:tbl>
       <w:tblPr>
         <w:tblStyle w:val="6"/>
-        <w:tblW w:w="0" w:type="auto"/>
-        <w:tblInd w:w="1157" w:type="dxa"/>
+        <w:tblW w:w="11685" w:type="dxa"/>
+        <w:tblInd w:w="-479" w:type="dxa"/>
         <w:tblBorders>
           <w:top w:val="none" w:color="auto" w:sz="0" w:space="0"/>
           <w:left w:val="none" w:color="auto" w:sz="0" w:space="0"/>
@@ -1707,9 +1707,9 @@
         </w:tblCellMar>
       </w:tblPr>
       <w:tblGrid>
-        <w:gridCol w:w="2403"/>
-        <w:gridCol w:w="2937"/>
-        <w:gridCol w:w="4065"/>
+        <w:gridCol w:w="5100"/>
+        <w:gridCol w:w="765"/>
+        <w:gridCol w:w="5820"/>
       </w:tblGrid>
       <w:tr>
         <w:tblPrEx>
@@ -1730,7 +1730,7 @@
         </w:tblPrEx>
         <w:tc>
           <w:tcPr>
-            <w:tcW w:w="2403" w:type="dxa"/>
+            <w:tcW w:w="5100" w:type="dxa"/>
             <w:shd w:val="clear" w:color="auto" w:fill="auto"/>
             <w:vAlign w:val="center"/>
           </w:tcPr>
@@ -1748,7 +1748,7 @@
         </w:tc>
         <w:tc>
           <w:tcPr>
-            <w:tcW w:w="2937" w:type="dxa"/>
+            <w:tcW w:w="765" w:type="dxa"/>
             <w:vAlign w:val="center"/>
           </w:tcPr>
           <w:p>
@@ -1765,7 +1765,7 @@
         </w:tc>
         <w:tc>
           <w:tcPr>
-            <w:tcW w:w="4065" w:type="dxa"/>
+            <w:tcW w:w="5820" w:type="dxa"/>
             <w:shd w:val="clear" w:color="auto" w:fill="auto"/>
             <w:vAlign w:val="center"/>
           </w:tcPr>
@@ -1809,7 +1809,7 @@
         </w:tblPrEx>
         <w:tc>
           <w:tcPr>
-            <w:tcW w:w="2403" w:type="dxa"/>
+            <w:tcW w:w="5100" w:type="dxa"/>
             <w:shd w:val="clear" w:color="auto" w:fill="auto"/>
             <w:vAlign w:val="center"/>
           </w:tcPr>
@@ -1835,7 +1835,7 @@
         </w:tc>
         <w:tc>
           <w:tcPr>
-            <w:tcW w:w="2937" w:type="dxa"/>
+            <w:tcW w:w="765" w:type="dxa"/>
             <w:vAlign w:val="center"/>
           </w:tcPr>
           <w:p>
@@ -1852,7 +1852,7 @@
         </w:tc>
         <w:tc>
           <w:tcPr>
-            <w:tcW w:w="4065" w:type="dxa"/>
+            <w:tcW w:w="5820" w:type="dxa"/>
             <w:shd w:val="clear" w:color="auto" w:fill="auto"/>
             <w:vAlign w:val="center"/>
           </w:tcPr>
@@ -1872,7 +1872,44 @@
                 <w:sz w:val="22"/>
                 <w:szCs w:val="22"/>
               </w:rPr>
-              <w:t>Mengetahui,</w:t>
+              <w:t>M</w:t>
+            </w:r>
+            <w:bookmarkStart w:id="0" w:name="_GoBack"/>
+            <w:bookmarkEnd w:id="0"/>
+            <w:r>
+              <w:rPr>
+                <w:rFonts w:ascii="Arial" w:hAnsi="Arial"/>
+                <w:sz w:val="22"/>
+                <w:szCs w:val="22"/>
+              </w:rPr>
+              <w:t>engetahui,</w:t>
+            </w:r>
+          </w:p>
+          <w:p>
+            <w:pPr>
+              <w:widowControl w:val="0"/>
+              <w:jc w:val="center"/>
+              <w:rPr>
+                <w:rFonts w:ascii="Arial" w:hAnsi="Arial"/>
+                <w:sz w:val="22"/>
+                <w:szCs w:val="22"/>
+              </w:rPr>
+            </w:pPr>
+            <w:r>
+              <w:rPr>
+                <w:rFonts w:hint="default" w:ascii="Arial" w:hAnsi="Arial" w:eastAsia="SimSun" w:cs="Arial"/>
+                <w:sz w:val="22"/>
+                <w:szCs w:val="22"/>
+              </w:rPr>
+              <w:t>LURAH ${skpd_kel}</w:t>
+            </w:r>
+            <w:r>
+              <w:rPr>
+                <w:rFonts w:ascii="Arial" w:hAnsi="Arial"/>
+                <w:sz w:val="22"/>
+                <w:szCs w:val="22"/>
+              </w:rPr>
+              <w:t>,</w:t>
             </w:r>
           </w:p>
         </w:tc>
@@ -1896,7 +1933,7 @@
         </w:tblPrEx>
         <w:tc>
           <w:tcPr>
-            <w:tcW w:w="2403" w:type="dxa"/>
+            <w:tcW w:w="5100" w:type="dxa"/>
             <w:shd w:val="clear" w:color="auto" w:fill="auto"/>
             <w:vAlign w:val="center"/>
           </w:tcPr>
@@ -1991,7 +2028,7 @@
         </w:tc>
         <w:tc>
           <w:tcPr>
-            <w:tcW w:w="2937" w:type="dxa"/>
+            <w:tcW w:w="765" w:type="dxa"/>
             <w:vAlign w:val="center"/>
           </w:tcPr>
           <w:p>
@@ -2008,7 +2045,7 @@
         </w:tc>
         <w:tc>
           <w:tcPr>
-            <w:tcW w:w="4065" w:type="dxa"/>
+            <w:tcW w:w="5820" w:type="dxa"/>
             <w:shd w:val="clear" w:color="auto" w:fill="auto"/>
             <w:vAlign w:val="center"/>
           </w:tcPr>
@@ -2025,16 +2062,11 @@
             <w:r>
               <w:rPr>
                 <w:rFonts w:ascii="Arial" w:hAnsi="Arial"/>
-              </w:rPr>
-              <w:t>${qr}</w:t>
-            </w:r>
-            <w:r>
-              <w:rPr>
-                <w:rFonts w:ascii="Arial" w:hAnsi="Arial"/>
-                <w:color w:val="FFFFFF"/>
-                <w:sz w:val="2"/>
-              </w:rPr>
-              <w:t>~</w:t>
+                <w:color w:val="auto"/>
+                <w:sz w:val="22"/>
+                <w:szCs w:val="22"/>
+              </w:rPr>
+              <w:t>${qr}~</w:t>
             </w:r>
           </w:p>
         </w:tc>
@@ -2058,7 +2090,7 @@
         </w:tblPrEx>
         <w:tc>
           <w:tcPr>
-            <w:tcW w:w="2403" w:type="dxa"/>
+            <w:tcW w:w="5100" w:type="dxa"/>
             <w:shd w:val="clear" w:color="auto" w:fill="auto"/>
             <w:vAlign w:val="center"/>
           </w:tcPr>
@@ -2085,7 +2117,7 @@
         </w:tc>
         <w:tc>
           <w:tcPr>
-            <w:tcW w:w="2937" w:type="dxa"/>
+            <w:tcW w:w="765" w:type="dxa"/>
             <w:vAlign w:val="center"/>
           </w:tcPr>
           <w:p>
@@ -2100,7 +2132,7 @@
         </w:tc>
         <w:tc>
           <w:tcPr>
-            <w:tcW w:w="4065" w:type="dxa"/>
+            <w:tcW w:w="5820" w:type="dxa"/>
             <w:shd w:val="clear" w:color="auto" w:fill="auto"/>
             <w:vAlign w:val="center"/>
           </w:tcPr>
@@ -2111,6 +2143,7 @@
               <w:rPr>
                 <w:rFonts w:ascii="Arial" w:hAnsi="Arial" w:cs="Arial"/>
                 <w:b/>
+                <w:bCs w:val="0"/>
                 <w:sz w:val="22"/>
                 <w:szCs w:val="22"/>
                 <w:u w:val="single"/>
@@ -2120,6 +2153,7 @@
               <w:rPr>
                 <w:rFonts w:ascii="Arial" w:hAnsi="Arial" w:cs="Arial"/>
                 <w:b/>
+                <w:bCs w:val="0"/>
                 <w:sz w:val="22"/>
                 <w:szCs w:val="22"/>
                 <w:u w:val="single"/>
@@ -2140,6 +2174,10 @@
             <w:r>
               <w:rPr>
                 <w:rFonts w:ascii="Arial" w:hAnsi="Arial" w:eastAsia="Arial"/>
+                <w:b/>
+                <w:bCs w:val="0"/>
+                <w:sz w:val="22"/>
+                <w:szCs w:val="22"/>
               </w:rPr>
               <w:t xml:space="preserve">NIP. </w:t>
             </w:r>
@@ -2147,6 +2185,7 @@
               <w:rPr>
                 <w:rFonts w:ascii="Arial" w:hAnsi="Arial" w:cs="Arial"/>
                 <w:b/>
+                <w:bCs w:val="0"/>
                 <w:sz w:val="22"/>
                 <w:szCs w:val="22"/>
               </w:rPr>
@@ -2174,8 +2213,6 @@
           <w:szCs w:val="22"/>
         </w:rPr>
       </w:pPr>
-      <w:bookmarkStart w:id="0" w:name="_GoBack"/>
-      <w:bookmarkEnd w:id="0"/>
     </w:p>
     <w:sectPr>
       <w:headerReference r:id="rId3" w:type="default"/>

</xml_diff>